<commit_message>
Add repo link to the article's intro
</commit_message>
<xml_diff>
--- a/article/Articulo_ProyectoFinal_PySpark.docx
+++ b/article/Articulo_ProyectoFinal_PySpark.docx
@@ -18,6 +18,20 @@
       <w:r>
         <w:t>Como parte del trabajo con el ecosistema de Big Data — Hadoop, Hive y Spark — armé un caso práctico en PySpark sobre Databricks: un DataFrame con datos de personas (nombre, edad, ciudad) para recorrer las operaciones más habituales al procesar datos distribuidos, desde filtros y columnas calculadas hasta agregaciones y consultas SQL directas sobre el DataFrame.</w:t>
       </w:r>
+    </w:p>
+    <w:p>
+      <w:r>
+        <w:t xml:space="preserve">Código completo: </w:t>
+      </w:r>
+      <w:hyperlink r:id="rId9">
+        <w:r>
+          <w:rPr>
+            <w:color w:val="0563C1"/>
+            <w:u w:val="single"/>
+          </w:rPr>
+          <w:t>github.com/Kevinsrm31/pyspark-dataframes-transformaciones</w:t>
+        </w:r>
+      </w:hyperlink>
     </w:p>
     <w:p>
       <w:pPr>

</xml_diff>

<commit_message>
Add real Spark output after each code snippet in the article
</commit_message>
<xml_diff>
--- a/article/Articulo_ProyectoFinal_PySpark.docx
+++ b/article/Articulo_ProyectoFinal_PySpark.docx
@@ -20,6 +20,9 @@
       </w:r>
     </w:p>
     <w:p>
+      <w:pPr>
+        <w:spacing w:after="200"/>
+      </w:pPr>
       <w:r>
         <w:t xml:space="preserve">Código completo: </w:t>
       </w:r>
@@ -147,6 +150,115 @@
     </w:p>
     <w:p>
       <w:pPr>
+        <w:spacing w:after="40"/>
+      </w:pPr>
+      <w:r>
+        <w:rPr>
+          <w:i/>
+          <w:color w:val="666666"/>
+          <w:sz w:val="20"/>
+        </w:rPr>
+        <w:t>Resultado:</w:t>
+      </w:r>
+    </w:p>
+    <w:p>
+      <w:pPr>
+        <w:spacing w:after="0"/>
+      </w:pPr>
+      <w:r>
+        <w:rPr>
+          <w:rFonts w:ascii="Courier New" w:hAnsi="Courier New"/>
+          <w:color w:val="1A1A1A"/>
+          <w:sz w:val="20"/>
+        </w:rPr>
+        <w:t>+-------+----+-----------+</w:t>
+      </w:r>
+    </w:p>
+    <w:p>
+      <w:pPr>
+        <w:spacing w:after="0"/>
+      </w:pPr>
+      <w:r>
+        <w:rPr>
+          <w:rFonts w:ascii="Courier New" w:hAnsi="Courier New"/>
+          <w:color w:val="1A1A1A"/>
+          <w:sz w:val="20"/>
+        </w:rPr>
+        <w:t>| Nombre|Edad|     Ciudad|</w:t>
+      </w:r>
+    </w:p>
+    <w:p>
+      <w:pPr>
+        <w:spacing w:after="0"/>
+      </w:pPr>
+      <w:r>
+        <w:rPr>
+          <w:rFonts w:ascii="Courier New" w:hAnsi="Courier New"/>
+          <w:color w:val="1A1A1A"/>
+          <w:sz w:val="20"/>
+        </w:rPr>
+        <w:t>+-------+----+-----------+</w:t>
+      </w:r>
+    </w:p>
+    <w:p>
+      <w:pPr>
+        <w:spacing w:after="0"/>
+      </w:pPr>
+      <w:r>
+        <w:rPr>
+          <w:rFonts w:ascii="Courier New" w:hAnsi="Courier New"/>
+          <w:color w:val="1A1A1A"/>
+          <w:sz w:val="20"/>
+        </w:rPr>
+        <w:t>|  Alice|  25|   New York|</w:t>
+      </w:r>
+    </w:p>
+    <w:p>
+      <w:pPr>
+        <w:spacing w:after="0"/>
+      </w:pPr>
+      <w:r>
+        <w:rPr>
+          <w:rFonts w:ascii="Courier New" w:hAnsi="Courier New"/>
+          <w:color w:val="1A1A1A"/>
+          <w:sz w:val="20"/>
+        </w:rPr>
+        <w:t>|    Bob|  30|Los Angeles|</w:t>
+      </w:r>
+    </w:p>
+    <w:p>
+      <w:pPr>
+        <w:spacing w:after="0"/>
+      </w:pPr>
+      <w:r>
+        <w:rPr>
+          <w:rFonts w:ascii="Courier New" w:hAnsi="Courier New"/>
+          <w:color w:val="1A1A1A"/>
+          <w:sz w:val="20"/>
+        </w:rPr>
+        <w:t>|Charlie|  22|    Chicago|</w:t>
+      </w:r>
+    </w:p>
+    <w:p>
+      <w:pPr>
+        <w:spacing w:after="0"/>
+      </w:pPr>
+      <w:r>
+        <w:rPr>
+          <w:rFonts w:ascii="Courier New" w:hAnsi="Courier New"/>
+          <w:color w:val="1A1A1A"/>
+          <w:sz w:val="20"/>
+        </w:rPr>
+        <w:t>+-------+----+-----------+</w:t>
+      </w:r>
+    </w:p>
+    <w:p>
+      <w:pPr>
+        <w:spacing w:after="120"/>
+      </w:pPr>
+    </w:p>
+    <w:p>
+      <w:pPr>
         <w:pStyle w:val="Heading1"/>
       </w:pPr>
       <w:r>
@@ -163,15 +275,10 @@
     </w:p>
     <w:p>
       <w:pPr>
-        <w:spacing w:after="0"/>
+        <w:spacing w:after="200"/>
       </w:pPr>
       <w:r>
-        <w:rPr>
-          <w:rFonts w:ascii="Courier New" w:hAnsi="Courier New"/>
-          <w:color w:val="333333"/>
-          <w:sz w:val="20"/>
-        </w:rPr>
-        <w:t># Solo la columna Nombre</w:t>
+        <w:t>Solo la columna Nombre:</w:t>
       </w:r>
     </w:p>
     <w:p>
@@ -189,15 +296,33 @@
     </w:p>
     <w:p>
       <w:pPr>
+        <w:spacing w:after="120"/>
+      </w:pPr>
+    </w:p>
+    <w:p>
+      <w:pPr>
+        <w:spacing w:after="40"/>
+      </w:pPr>
+      <w:r>
+        <w:rPr>
+          <w:i/>
+          <w:color w:val="666666"/>
+          <w:sz w:val="20"/>
+        </w:rPr>
+        <w:t>Resultado:</w:t>
+      </w:r>
+    </w:p>
+    <w:p>
+      <w:pPr>
         <w:spacing w:after="0"/>
       </w:pPr>
       <w:r>
         <w:rPr>
           <w:rFonts w:ascii="Courier New" w:hAnsi="Courier New"/>
-          <w:color w:val="333333"/>
+          <w:color w:val="1A1A1A"/>
           <w:sz w:val="20"/>
         </w:rPr>
-        <w:t xml:space="preserve"> </w:t>
+        <w:t>+-------+</w:t>
       </w:r>
     </w:p>
     <w:p>
@@ -207,10 +332,88 @@
       <w:r>
         <w:rPr>
           <w:rFonts w:ascii="Courier New" w:hAnsi="Courier New"/>
-          <w:color w:val="333333"/>
+          <w:color w:val="1A1A1A"/>
           <w:sz w:val="20"/>
         </w:rPr>
-        <w:t># Personas con 25 años o más</w:t>
+        <w:t>| Nombre|</w:t>
+      </w:r>
+    </w:p>
+    <w:p>
+      <w:pPr>
+        <w:spacing w:after="0"/>
+      </w:pPr>
+      <w:r>
+        <w:rPr>
+          <w:rFonts w:ascii="Courier New" w:hAnsi="Courier New"/>
+          <w:color w:val="1A1A1A"/>
+          <w:sz w:val="20"/>
+        </w:rPr>
+        <w:t>+-------+</w:t>
+      </w:r>
+    </w:p>
+    <w:p>
+      <w:pPr>
+        <w:spacing w:after="0"/>
+      </w:pPr>
+      <w:r>
+        <w:rPr>
+          <w:rFonts w:ascii="Courier New" w:hAnsi="Courier New"/>
+          <w:color w:val="1A1A1A"/>
+          <w:sz w:val="20"/>
+        </w:rPr>
+        <w:t>|  Alice|</w:t>
+      </w:r>
+    </w:p>
+    <w:p>
+      <w:pPr>
+        <w:spacing w:after="0"/>
+      </w:pPr>
+      <w:r>
+        <w:rPr>
+          <w:rFonts w:ascii="Courier New" w:hAnsi="Courier New"/>
+          <w:color w:val="1A1A1A"/>
+          <w:sz w:val="20"/>
+        </w:rPr>
+        <w:t>|    Bob|</w:t>
+      </w:r>
+    </w:p>
+    <w:p>
+      <w:pPr>
+        <w:spacing w:after="0"/>
+      </w:pPr>
+      <w:r>
+        <w:rPr>
+          <w:rFonts w:ascii="Courier New" w:hAnsi="Courier New"/>
+          <w:color w:val="1A1A1A"/>
+          <w:sz w:val="20"/>
+        </w:rPr>
+        <w:t>|Charlie|</w:t>
+      </w:r>
+    </w:p>
+    <w:p>
+      <w:pPr>
+        <w:spacing w:after="0"/>
+      </w:pPr>
+      <w:r>
+        <w:rPr>
+          <w:rFonts w:ascii="Courier New" w:hAnsi="Courier New"/>
+          <w:color w:val="1A1A1A"/>
+          <w:sz w:val="20"/>
+        </w:rPr>
+        <w:t>+-------+</w:t>
+      </w:r>
+    </w:p>
+    <w:p>
+      <w:pPr>
+        <w:spacing w:after="120"/>
+      </w:pPr>
+    </w:p>
+    <w:p>
+      <w:pPr>
+        <w:spacing w:after="200"/>
+      </w:pPr>
+      <w:r>
+        <w:t>Personas con 25 años o más:</w:t>
       </w:r>
     </w:p>
     <w:p>
@@ -228,15 +431,33 @@
     </w:p>
     <w:p>
       <w:pPr>
+        <w:spacing w:after="120"/>
+      </w:pPr>
+    </w:p>
+    <w:p>
+      <w:pPr>
+        <w:spacing w:after="40"/>
+      </w:pPr>
+      <w:r>
+        <w:rPr>
+          <w:i/>
+          <w:color w:val="666666"/>
+          <w:sz w:val="20"/>
+        </w:rPr>
+        <w:t>Resultado:</w:t>
+      </w:r>
+    </w:p>
+    <w:p>
+      <w:pPr>
         <w:spacing w:after="0"/>
       </w:pPr>
       <w:r>
         <w:rPr>
           <w:rFonts w:ascii="Courier New" w:hAnsi="Courier New"/>
-          <w:color w:val="333333"/>
+          <w:color w:val="1A1A1A"/>
           <w:sz w:val="20"/>
         </w:rPr>
-        <w:t xml:space="preserve"> </w:t>
+        <w:t>+------+----+-----------+</w:t>
       </w:r>
     </w:p>
     <w:p>
@@ -246,10 +467,75 @@
       <w:r>
         <w:rPr>
           <w:rFonts w:ascii="Courier New" w:hAnsi="Courier New"/>
-          <w:color w:val="333333"/>
+          <w:color w:val="1A1A1A"/>
           <w:sz w:val="20"/>
         </w:rPr>
-        <w:t># Personas de Chicago menores de 30 años</w:t>
+        <w:t>|Nombre|Edad|     Ciudad|</w:t>
+      </w:r>
+    </w:p>
+    <w:p>
+      <w:pPr>
+        <w:spacing w:after="0"/>
+      </w:pPr>
+      <w:r>
+        <w:rPr>
+          <w:rFonts w:ascii="Courier New" w:hAnsi="Courier New"/>
+          <w:color w:val="1A1A1A"/>
+          <w:sz w:val="20"/>
+        </w:rPr>
+        <w:t>+------+----+-----------+</w:t>
+      </w:r>
+    </w:p>
+    <w:p>
+      <w:pPr>
+        <w:spacing w:after="0"/>
+      </w:pPr>
+      <w:r>
+        <w:rPr>
+          <w:rFonts w:ascii="Courier New" w:hAnsi="Courier New"/>
+          <w:color w:val="1A1A1A"/>
+          <w:sz w:val="20"/>
+        </w:rPr>
+        <w:t>| Alice|  25|   New York|</w:t>
+      </w:r>
+    </w:p>
+    <w:p>
+      <w:pPr>
+        <w:spacing w:after="0"/>
+      </w:pPr>
+      <w:r>
+        <w:rPr>
+          <w:rFonts w:ascii="Courier New" w:hAnsi="Courier New"/>
+          <w:color w:val="1A1A1A"/>
+          <w:sz w:val="20"/>
+        </w:rPr>
+        <w:t>|   Bob|  30|Los Angeles|</w:t>
+      </w:r>
+    </w:p>
+    <w:p>
+      <w:pPr>
+        <w:spacing w:after="0"/>
+      </w:pPr>
+      <w:r>
+        <w:rPr>
+          <w:rFonts w:ascii="Courier New" w:hAnsi="Courier New"/>
+          <w:color w:val="1A1A1A"/>
+          <w:sz w:val="20"/>
+        </w:rPr>
+        <w:t>+------+----+-----------+</w:t>
+      </w:r>
+    </w:p>
+    <w:p>
+      <w:pPr>
+        <w:spacing w:after="120"/>
+      </w:pPr>
+    </w:p>
+    <w:p>
+      <w:pPr>
+        <w:spacing w:after="200"/>
+      </w:pPr>
+      <w:r>
+        <w:t>Personas de Chicago menores de 30 años:</w:t>
       </w:r>
     </w:p>
     <w:p>
@@ -267,15 +553,33 @@
     </w:p>
     <w:p>
       <w:pPr>
+        <w:spacing w:after="120"/>
+      </w:pPr>
+    </w:p>
+    <w:p>
+      <w:pPr>
+        <w:spacing w:after="40"/>
+      </w:pPr>
+      <w:r>
+        <w:rPr>
+          <w:i/>
+          <w:color w:val="666666"/>
+          <w:sz w:val="20"/>
+        </w:rPr>
+        <w:t>Resultado:</w:t>
+      </w:r>
+    </w:p>
+    <w:p>
+      <w:pPr>
         <w:spacing w:after="0"/>
       </w:pPr>
       <w:r>
         <w:rPr>
           <w:rFonts w:ascii="Courier New" w:hAnsi="Courier New"/>
-          <w:color w:val="333333"/>
+          <w:color w:val="1A1A1A"/>
           <w:sz w:val="20"/>
         </w:rPr>
-        <w:t xml:space="preserve"> </w:t>
+        <w:t>+-------+----+-------+</w:t>
       </w:r>
     </w:p>
     <w:p>
@@ -285,10 +589,62 @@
       <w:r>
         <w:rPr>
           <w:rFonts w:ascii="Courier New" w:hAnsi="Courier New"/>
-          <w:color w:val="333333"/>
+          <w:color w:val="1A1A1A"/>
           <w:sz w:val="20"/>
         </w:rPr>
-        <w:t># Personas con edad par</w:t>
+        <w:t>| Nombre|Edad| Ciudad|</w:t>
+      </w:r>
+    </w:p>
+    <w:p>
+      <w:pPr>
+        <w:spacing w:after="0"/>
+      </w:pPr>
+      <w:r>
+        <w:rPr>
+          <w:rFonts w:ascii="Courier New" w:hAnsi="Courier New"/>
+          <w:color w:val="1A1A1A"/>
+          <w:sz w:val="20"/>
+        </w:rPr>
+        <w:t>+-------+----+-------+</w:t>
+      </w:r>
+    </w:p>
+    <w:p>
+      <w:pPr>
+        <w:spacing w:after="0"/>
+      </w:pPr>
+      <w:r>
+        <w:rPr>
+          <w:rFonts w:ascii="Courier New" w:hAnsi="Courier New"/>
+          <w:color w:val="1A1A1A"/>
+          <w:sz w:val="20"/>
+        </w:rPr>
+        <w:t>|Charlie|  22|Chicago|</w:t>
+      </w:r>
+    </w:p>
+    <w:p>
+      <w:pPr>
+        <w:spacing w:after="0"/>
+      </w:pPr>
+      <w:r>
+        <w:rPr>
+          <w:rFonts w:ascii="Courier New" w:hAnsi="Courier New"/>
+          <w:color w:val="1A1A1A"/>
+          <w:sz w:val="20"/>
+        </w:rPr>
+        <w:t>+-------+----+-------+</w:t>
+      </w:r>
+    </w:p>
+    <w:p>
+      <w:pPr>
+        <w:spacing w:after="120"/>
+      </w:pPr>
+    </w:p>
+    <w:p>
+      <w:pPr>
+        <w:spacing w:after="200"/>
+      </w:pPr>
+      <w:r>
+        <w:t>Personas con edad par:</w:t>
       </w:r>
     </w:p>
     <w:p>
@@ -311,6 +667,102 @@
     </w:p>
     <w:p>
       <w:pPr>
+        <w:spacing w:after="40"/>
+      </w:pPr>
+      <w:r>
+        <w:rPr>
+          <w:i/>
+          <w:color w:val="666666"/>
+          <w:sz w:val="20"/>
+        </w:rPr>
+        <w:t>Resultado:</w:t>
+      </w:r>
+    </w:p>
+    <w:p>
+      <w:pPr>
+        <w:spacing w:after="0"/>
+      </w:pPr>
+      <w:r>
+        <w:rPr>
+          <w:rFonts w:ascii="Courier New" w:hAnsi="Courier New"/>
+          <w:color w:val="1A1A1A"/>
+          <w:sz w:val="20"/>
+        </w:rPr>
+        <w:t>+-------+----+-----------+</w:t>
+      </w:r>
+    </w:p>
+    <w:p>
+      <w:pPr>
+        <w:spacing w:after="0"/>
+      </w:pPr>
+      <w:r>
+        <w:rPr>
+          <w:rFonts w:ascii="Courier New" w:hAnsi="Courier New"/>
+          <w:color w:val="1A1A1A"/>
+          <w:sz w:val="20"/>
+        </w:rPr>
+        <w:t>| Nombre|Edad|     Ciudad|</w:t>
+      </w:r>
+    </w:p>
+    <w:p>
+      <w:pPr>
+        <w:spacing w:after="0"/>
+      </w:pPr>
+      <w:r>
+        <w:rPr>
+          <w:rFonts w:ascii="Courier New" w:hAnsi="Courier New"/>
+          <w:color w:val="1A1A1A"/>
+          <w:sz w:val="20"/>
+        </w:rPr>
+        <w:t>+-------+----+-----------+</w:t>
+      </w:r>
+    </w:p>
+    <w:p>
+      <w:pPr>
+        <w:spacing w:after="0"/>
+      </w:pPr>
+      <w:r>
+        <w:rPr>
+          <w:rFonts w:ascii="Courier New" w:hAnsi="Courier New"/>
+          <w:color w:val="1A1A1A"/>
+          <w:sz w:val="20"/>
+        </w:rPr>
+        <w:t>|    Bob|  30|Los Angeles|</w:t>
+      </w:r>
+    </w:p>
+    <w:p>
+      <w:pPr>
+        <w:spacing w:after="0"/>
+      </w:pPr>
+      <w:r>
+        <w:rPr>
+          <w:rFonts w:ascii="Courier New" w:hAnsi="Courier New"/>
+          <w:color w:val="1A1A1A"/>
+          <w:sz w:val="20"/>
+        </w:rPr>
+        <w:t>|Charlie|  22|    Chicago|</w:t>
+      </w:r>
+    </w:p>
+    <w:p>
+      <w:pPr>
+        <w:spacing w:after="0"/>
+      </w:pPr>
+      <w:r>
+        <w:rPr>
+          <w:rFonts w:ascii="Courier New" w:hAnsi="Courier New"/>
+          <w:color w:val="1A1A1A"/>
+          <w:sz w:val="20"/>
+        </w:rPr>
+        <w:t>+-------+----+-----------+</w:t>
+      </w:r>
+    </w:p>
+    <w:p>
+      <w:pPr>
+        <w:spacing w:after="120"/>
+      </w:pPr>
+    </w:p>
+    <w:p>
+      <w:pPr>
         <w:pStyle w:val="Heading1"/>
       </w:pPr>
       <w:r>
@@ -323,6 +775,14 @@
       </w:pPr>
       <w:r>
         <w:t>withColumn(), withColumnRenamed() y drop() permiten agregar, renombrar o eliminar columnas sin mutar el DataFrame original: cada operación devuelve una copia nueva.</w:t>
+      </w:r>
+    </w:p>
+    <w:p>
+      <w:pPr>
+        <w:spacing w:after="200"/>
+      </w:pPr>
+      <w:r>
+        <w:t>Nueva columna con un valor constante:</w:t>
       </w:r>
     </w:p>
     <w:p>
@@ -335,7 +795,129 @@
           <w:color w:val="333333"/>
           <w:sz w:val="20"/>
         </w:rPr>
-        <w:t># Nueva columna con un valor constante</w:t>
+        <w:t>df.withColumn("Pais", lit("Estados Unidos")).show()</w:t>
+      </w:r>
+    </w:p>
+    <w:p>
+      <w:pPr>
+        <w:spacing w:after="120"/>
+      </w:pPr>
+    </w:p>
+    <w:p>
+      <w:pPr>
+        <w:spacing w:after="40"/>
+      </w:pPr>
+      <w:r>
+        <w:rPr>
+          <w:i/>
+          <w:color w:val="666666"/>
+          <w:sz w:val="20"/>
+        </w:rPr>
+        <w:t>Resultado:</w:t>
+      </w:r>
+    </w:p>
+    <w:p>
+      <w:pPr>
+        <w:spacing w:after="0"/>
+      </w:pPr>
+      <w:r>
+        <w:rPr>
+          <w:rFonts w:ascii="Courier New" w:hAnsi="Courier New"/>
+          <w:color w:val="1A1A1A"/>
+          <w:sz w:val="20"/>
+        </w:rPr>
+        <w:t>+-------+----+-----------+--------------+</w:t>
+      </w:r>
+    </w:p>
+    <w:p>
+      <w:pPr>
+        <w:spacing w:after="0"/>
+      </w:pPr>
+      <w:r>
+        <w:rPr>
+          <w:rFonts w:ascii="Courier New" w:hAnsi="Courier New"/>
+          <w:color w:val="1A1A1A"/>
+          <w:sz w:val="20"/>
+        </w:rPr>
+        <w:t>| Nombre|Edad|     Ciudad|          Pais|</w:t>
+      </w:r>
+    </w:p>
+    <w:p>
+      <w:pPr>
+        <w:spacing w:after="0"/>
+      </w:pPr>
+      <w:r>
+        <w:rPr>
+          <w:rFonts w:ascii="Courier New" w:hAnsi="Courier New"/>
+          <w:color w:val="1A1A1A"/>
+          <w:sz w:val="20"/>
+        </w:rPr>
+        <w:t>+-------+----+-----------+--------------+</w:t>
+      </w:r>
+    </w:p>
+    <w:p>
+      <w:pPr>
+        <w:spacing w:after="0"/>
+      </w:pPr>
+      <w:r>
+        <w:rPr>
+          <w:rFonts w:ascii="Courier New" w:hAnsi="Courier New"/>
+          <w:color w:val="1A1A1A"/>
+          <w:sz w:val="20"/>
+        </w:rPr>
+        <w:t>|  Alice|  25|   New York|Estados Unidos|</w:t>
+      </w:r>
+    </w:p>
+    <w:p>
+      <w:pPr>
+        <w:spacing w:after="0"/>
+      </w:pPr>
+      <w:r>
+        <w:rPr>
+          <w:rFonts w:ascii="Courier New" w:hAnsi="Courier New"/>
+          <w:color w:val="1A1A1A"/>
+          <w:sz w:val="20"/>
+        </w:rPr>
+        <w:t>|    Bob|  30|Los Angeles|Estados Unidos|</w:t>
+      </w:r>
+    </w:p>
+    <w:p>
+      <w:pPr>
+        <w:spacing w:after="0"/>
+      </w:pPr>
+      <w:r>
+        <w:rPr>
+          <w:rFonts w:ascii="Courier New" w:hAnsi="Courier New"/>
+          <w:color w:val="1A1A1A"/>
+          <w:sz w:val="20"/>
+        </w:rPr>
+        <w:t>|Charlie|  22|    Chicago|Estados Unidos|</w:t>
+      </w:r>
+    </w:p>
+    <w:p>
+      <w:pPr>
+        <w:spacing w:after="0"/>
+      </w:pPr>
+      <w:r>
+        <w:rPr>
+          <w:rFonts w:ascii="Courier New" w:hAnsi="Courier New"/>
+          <w:color w:val="1A1A1A"/>
+          <w:sz w:val="20"/>
+        </w:rPr>
+        <w:t>+-------+----+-----------+--------------+</w:t>
+      </w:r>
+    </w:p>
+    <w:p>
+      <w:pPr>
+        <w:spacing w:after="120"/>
+      </w:pPr>
+    </w:p>
+    <w:p>
+      <w:pPr>
+        <w:spacing w:after="200"/>
+      </w:pPr>
+      <w:r>
+        <w:t>Renombrar una columna existente:</w:t>
       </w:r>
     </w:p>
     <w:p>
@@ -348,7 +930,129 @@
           <w:color w:val="333333"/>
           <w:sz w:val="20"/>
         </w:rPr>
-        <w:t>df.withColumn("Pais", lit("Estados Unidos"))</w:t>
+        <w:t>df.withColumnRenamed("Nombre", "NombreCompleto").show()</w:t>
+      </w:r>
+    </w:p>
+    <w:p>
+      <w:pPr>
+        <w:spacing w:after="120"/>
+      </w:pPr>
+    </w:p>
+    <w:p>
+      <w:pPr>
+        <w:spacing w:after="40"/>
+      </w:pPr>
+      <w:r>
+        <w:rPr>
+          <w:i/>
+          <w:color w:val="666666"/>
+          <w:sz w:val="20"/>
+        </w:rPr>
+        <w:t>Resultado:</w:t>
+      </w:r>
+    </w:p>
+    <w:p>
+      <w:pPr>
+        <w:spacing w:after="0"/>
+      </w:pPr>
+      <w:r>
+        <w:rPr>
+          <w:rFonts w:ascii="Courier New" w:hAnsi="Courier New"/>
+          <w:color w:val="1A1A1A"/>
+          <w:sz w:val="20"/>
+        </w:rPr>
+        <w:t>+--------------+----+-----------+</w:t>
+      </w:r>
+    </w:p>
+    <w:p>
+      <w:pPr>
+        <w:spacing w:after="0"/>
+      </w:pPr>
+      <w:r>
+        <w:rPr>
+          <w:rFonts w:ascii="Courier New" w:hAnsi="Courier New"/>
+          <w:color w:val="1A1A1A"/>
+          <w:sz w:val="20"/>
+        </w:rPr>
+        <w:t>|NombreCompleto|Edad|     Ciudad|</w:t>
+      </w:r>
+    </w:p>
+    <w:p>
+      <w:pPr>
+        <w:spacing w:after="0"/>
+      </w:pPr>
+      <w:r>
+        <w:rPr>
+          <w:rFonts w:ascii="Courier New" w:hAnsi="Courier New"/>
+          <w:color w:val="1A1A1A"/>
+          <w:sz w:val="20"/>
+        </w:rPr>
+        <w:t>+--------------+----+-----------+</w:t>
+      </w:r>
+    </w:p>
+    <w:p>
+      <w:pPr>
+        <w:spacing w:after="0"/>
+      </w:pPr>
+      <w:r>
+        <w:rPr>
+          <w:rFonts w:ascii="Courier New" w:hAnsi="Courier New"/>
+          <w:color w:val="1A1A1A"/>
+          <w:sz w:val="20"/>
+        </w:rPr>
+        <w:t>|         Alice|  25|   New York|</w:t>
+      </w:r>
+    </w:p>
+    <w:p>
+      <w:pPr>
+        <w:spacing w:after="0"/>
+      </w:pPr>
+      <w:r>
+        <w:rPr>
+          <w:rFonts w:ascii="Courier New" w:hAnsi="Courier New"/>
+          <w:color w:val="1A1A1A"/>
+          <w:sz w:val="20"/>
+        </w:rPr>
+        <w:t>|           Bob|  30|Los Angeles|</w:t>
+      </w:r>
+    </w:p>
+    <w:p>
+      <w:pPr>
+        <w:spacing w:after="0"/>
+      </w:pPr>
+      <w:r>
+        <w:rPr>
+          <w:rFonts w:ascii="Courier New" w:hAnsi="Courier New"/>
+          <w:color w:val="1A1A1A"/>
+          <w:sz w:val="20"/>
+        </w:rPr>
+        <w:t>|       Charlie|  22|    Chicago|</w:t>
+      </w:r>
+    </w:p>
+    <w:p>
+      <w:pPr>
+        <w:spacing w:after="0"/>
+      </w:pPr>
+      <w:r>
+        <w:rPr>
+          <w:rFonts w:ascii="Courier New" w:hAnsi="Courier New"/>
+          <w:color w:val="1A1A1A"/>
+          <w:sz w:val="20"/>
+        </w:rPr>
+        <w:t>+--------------+----+-----------+</w:t>
+      </w:r>
+    </w:p>
+    <w:p>
+      <w:pPr>
+        <w:spacing w:after="120"/>
+      </w:pPr>
+    </w:p>
+    <w:p>
+      <w:pPr>
+        <w:spacing w:after="200"/>
+      </w:pPr>
+      <w:r>
+        <w:t>Eliminar una columna:</w:t>
       </w:r>
     </w:p>
     <w:p>
@@ -361,7 +1065,129 @@
           <w:color w:val="333333"/>
           <w:sz w:val="20"/>
         </w:rPr>
-        <w:t xml:space="preserve"> </w:t>
+        <w:t>df.drop("Edad").show()</w:t>
+      </w:r>
+    </w:p>
+    <w:p>
+      <w:pPr>
+        <w:spacing w:after="120"/>
+      </w:pPr>
+    </w:p>
+    <w:p>
+      <w:pPr>
+        <w:spacing w:after="40"/>
+      </w:pPr>
+      <w:r>
+        <w:rPr>
+          <w:i/>
+          <w:color w:val="666666"/>
+          <w:sz w:val="20"/>
+        </w:rPr>
+        <w:t>Resultado:</w:t>
+      </w:r>
+    </w:p>
+    <w:p>
+      <w:pPr>
+        <w:spacing w:after="0"/>
+      </w:pPr>
+      <w:r>
+        <w:rPr>
+          <w:rFonts w:ascii="Courier New" w:hAnsi="Courier New"/>
+          <w:color w:val="1A1A1A"/>
+          <w:sz w:val="20"/>
+        </w:rPr>
+        <w:t>+-------+-----------+</w:t>
+      </w:r>
+    </w:p>
+    <w:p>
+      <w:pPr>
+        <w:spacing w:after="0"/>
+      </w:pPr>
+      <w:r>
+        <w:rPr>
+          <w:rFonts w:ascii="Courier New" w:hAnsi="Courier New"/>
+          <w:color w:val="1A1A1A"/>
+          <w:sz w:val="20"/>
+        </w:rPr>
+        <w:t>| Nombre|     Ciudad|</w:t>
+      </w:r>
+    </w:p>
+    <w:p>
+      <w:pPr>
+        <w:spacing w:after="0"/>
+      </w:pPr>
+      <w:r>
+        <w:rPr>
+          <w:rFonts w:ascii="Courier New" w:hAnsi="Courier New"/>
+          <w:color w:val="1A1A1A"/>
+          <w:sz w:val="20"/>
+        </w:rPr>
+        <w:t>+-------+-----------+</w:t>
+      </w:r>
+    </w:p>
+    <w:p>
+      <w:pPr>
+        <w:spacing w:after="0"/>
+      </w:pPr>
+      <w:r>
+        <w:rPr>
+          <w:rFonts w:ascii="Courier New" w:hAnsi="Courier New"/>
+          <w:color w:val="1A1A1A"/>
+          <w:sz w:val="20"/>
+        </w:rPr>
+        <w:t>|  Alice|   New York|</w:t>
+      </w:r>
+    </w:p>
+    <w:p>
+      <w:pPr>
+        <w:spacing w:after="0"/>
+      </w:pPr>
+      <w:r>
+        <w:rPr>
+          <w:rFonts w:ascii="Courier New" w:hAnsi="Courier New"/>
+          <w:color w:val="1A1A1A"/>
+          <w:sz w:val="20"/>
+        </w:rPr>
+        <w:t>|    Bob|Los Angeles|</w:t>
+      </w:r>
+    </w:p>
+    <w:p>
+      <w:pPr>
+        <w:spacing w:after="0"/>
+      </w:pPr>
+      <w:r>
+        <w:rPr>
+          <w:rFonts w:ascii="Courier New" w:hAnsi="Courier New"/>
+          <w:color w:val="1A1A1A"/>
+          <w:sz w:val="20"/>
+        </w:rPr>
+        <w:t>|Charlie|    Chicago|</w:t>
+      </w:r>
+    </w:p>
+    <w:p>
+      <w:pPr>
+        <w:spacing w:after="0"/>
+      </w:pPr>
+      <w:r>
+        <w:rPr>
+          <w:rFonts w:ascii="Courier New" w:hAnsi="Courier New"/>
+          <w:color w:val="1A1A1A"/>
+          <w:sz w:val="20"/>
+        </w:rPr>
+        <w:t>+-------+-----------+</w:t>
+      </w:r>
+    </w:p>
+    <w:p>
+      <w:pPr>
+        <w:spacing w:after="120"/>
+      </w:pPr>
+    </w:p>
+    <w:p>
+      <w:pPr>
+        <w:spacing w:after="200"/>
+      </w:pPr>
+      <w:r>
+        <w:t>Columna calculada, el doble de la edad:</w:t>
       </w:r>
     </w:p>
     <w:p>
@@ -374,7 +1200,129 @@
           <w:color w:val="333333"/>
           <w:sz w:val="20"/>
         </w:rPr>
-        <w:t># Renombrar una columna existente</w:t>
+        <w:t>df.withColumn("EdadDuplicada", col("Edad") * 2).show()</w:t>
+      </w:r>
+    </w:p>
+    <w:p>
+      <w:pPr>
+        <w:spacing w:after="120"/>
+      </w:pPr>
+    </w:p>
+    <w:p>
+      <w:pPr>
+        <w:spacing w:after="40"/>
+      </w:pPr>
+      <w:r>
+        <w:rPr>
+          <w:i/>
+          <w:color w:val="666666"/>
+          <w:sz w:val="20"/>
+        </w:rPr>
+        <w:t>Resultado:</w:t>
+      </w:r>
+    </w:p>
+    <w:p>
+      <w:pPr>
+        <w:spacing w:after="0"/>
+      </w:pPr>
+      <w:r>
+        <w:rPr>
+          <w:rFonts w:ascii="Courier New" w:hAnsi="Courier New"/>
+          <w:color w:val="1A1A1A"/>
+          <w:sz w:val="20"/>
+        </w:rPr>
+        <w:t>+-------+----+-----------+-------------+</w:t>
+      </w:r>
+    </w:p>
+    <w:p>
+      <w:pPr>
+        <w:spacing w:after="0"/>
+      </w:pPr>
+      <w:r>
+        <w:rPr>
+          <w:rFonts w:ascii="Courier New" w:hAnsi="Courier New"/>
+          <w:color w:val="1A1A1A"/>
+          <w:sz w:val="20"/>
+        </w:rPr>
+        <w:t>| Nombre|Edad|     Ciudad|EdadDuplicada|</w:t>
+      </w:r>
+    </w:p>
+    <w:p>
+      <w:pPr>
+        <w:spacing w:after="0"/>
+      </w:pPr>
+      <w:r>
+        <w:rPr>
+          <w:rFonts w:ascii="Courier New" w:hAnsi="Courier New"/>
+          <w:color w:val="1A1A1A"/>
+          <w:sz w:val="20"/>
+        </w:rPr>
+        <w:t>+-------+----+-----------+-------------+</w:t>
+      </w:r>
+    </w:p>
+    <w:p>
+      <w:pPr>
+        <w:spacing w:after="0"/>
+      </w:pPr>
+      <w:r>
+        <w:rPr>
+          <w:rFonts w:ascii="Courier New" w:hAnsi="Courier New"/>
+          <w:color w:val="1A1A1A"/>
+          <w:sz w:val="20"/>
+        </w:rPr>
+        <w:t>|  Alice|  25|   New York|           50|</w:t>
+      </w:r>
+    </w:p>
+    <w:p>
+      <w:pPr>
+        <w:spacing w:after="0"/>
+      </w:pPr>
+      <w:r>
+        <w:rPr>
+          <w:rFonts w:ascii="Courier New" w:hAnsi="Courier New"/>
+          <w:color w:val="1A1A1A"/>
+          <w:sz w:val="20"/>
+        </w:rPr>
+        <w:t>|    Bob|  30|Los Angeles|           60|</w:t>
+      </w:r>
+    </w:p>
+    <w:p>
+      <w:pPr>
+        <w:spacing w:after="0"/>
+      </w:pPr>
+      <w:r>
+        <w:rPr>
+          <w:rFonts w:ascii="Courier New" w:hAnsi="Courier New"/>
+          <w:color w:val="1A1A1A"/>
+          <w:sz w:val="20"/>
+        </w:rPr>
+        <w:t>|Charlie|  22|    Chicago|           44|</w:t>
+      </w:r>
+    </w:p>
+    <w:p>
+      <w:pPr>
+        <w:spacing w:after="0"/>
+      </w:pPr>
+      <w:r>
+        <w:rPr>
+          <w:rFonts w:ascii="Courier New" w:hAnsi="Courier New"/>
+          <w:color w:val="1A1A1A"/>
+          <w:sz w:val="20"/>
+        </w:rPr>
+        <w:t>+-------+----+-----------+-------------+</w:t>
+      </w:r>
+    </w:p>
+    <w:p>
+      <w:pPr>
+        <w:spacing w:after="120"/>
+      </w:pPr>
+    </w:p>
+    <w:p>
+      <w:pPr>
+        <w:spacing w:after="200"/>
+      </w:pPr>
+      <w:r>
+        <w:t>Conversión de años a meses:</w:t>
       </w:r>
     </w:p>
     <w:p>
@@ -387,7 +1335,129 @@
           <w:color w:val="333333"/>
           <w:sz w:val="20"/>
         </w:rPr>
-        <w:t>df.withColumnRenamed("Nombre", "NombreCompleto")</w:t>
+        <w:t>df.withColumn("EdadEnMeses", col("Edad") * 12).show()</w:t>
+      </w:r>
+    </w:p>
+    <w:p>
+      <w:pPr>
+        <w:spacing w:after="120"/>
+      </w:pPr>
+    </w:p>
+    <w:p>
+      <w:pPr>
+        <w:spacing w:after="40"/>
+      </w:pPr>
+      <w:r>
+        <w:rPr>
+          <w:i/>
+          <w:color w:val="666666"/>
+          <w:sz w:val="20"/>
+        </w:rPr>
+        <w:t>Resultado:</w:t>
+      </w:r>
+    </w:p>
+    <w:p>
+      <w:pPr>
+        <w:spacing w:after="0"/>
+      </w:pPr>
+      <w:r>
+        <w:rPr>
+          <w:rFonts w:ascii="Courier New" w:hAnsi="Courier New"/>
+          <w:color w:val="1A1A1A"/>
+          <w:sz w:val="20"/>
+        </w:rPr>
+        <w:t>+-------+----+-----------+-----------+</w:t>
+      </w:r>
+    </w:p>
+    <w:p>
+      <w:pPr>
+        <w:spacing w:after="0"/>
+      </w:pPr>
+      <w:r>
+        <w:rPr>
+          <w:rFonts w:ascii="Courier New" w:hAnsi="Courier New"/>
+          <w:color w:val="1A1A1A"/>
+          <w:sz w:val="20"/>
+        </w:rPr>
+        <w:t>| Nombre|Edad|     Ciudad|EdadEnMeses|</w:t>
+      </w:r>
+    </w:p>
+    <w:p>
+      <w:pPr>
+        <w:spacing w:after="0"/>
+      </w:pPr>
+      <w:r>
+        <w:rPr>
+          <w:rFonts w:ascii="Courier New" w:hAnsi="Courier New"/>
+          <w:color w:val="1A1A1A"/>
+          <w:sz w:val="20"/>
+        </w:rPr>
+        <w:t>+-------+----+-----------+-----------+</w:t>
+      </w:r>
+    </w:p>
+    <w:p>
+      <w:pPr>
+        <w:spacing w:after="0"/>
+      </w:pPr>
+      <w:r>
+        <w:rPr>
+          <w:rFonts w:ascii="Courier New" w:hAnsi="Courier New"/>
+          <w:color w:val="1A1A1A"/>
+          <w:sz w:val="20"/>
+        </w:rPr>
+        <w:t>|  Alice|  25|   New York|        300|</w:t>
+      </w:r>
+    </w:p>
+    <w:p>
+      <w:pPr>
+        <w:spacing w:after="0"/>
+      </w:pPr>
+      <w:r>
+        <w:rPr>
+          <w:rFonts w:ascii="Courier New" w:hAnsi="Courier New"/>
+          <w:color w:val="1A1A1A"/>
+          <w:sz w:val="20"/>
+        </w:rPr>
+        <w:t>|    Bob|  30|Los Angeles|        360|</w:t>
+      </w:r>
+    </w:p>
+    <w:p>
+      <w:pPr>
+        <w:spacing w:after="0"/>
+      </w:pPr>
+      <w:r>
+        <w:rPr>
+          <w:rFonts w:ascii="Courier New" w:hAnsi="Courier New"/>
+          <w:color w:val="1A1A1A"/>
+          <w:sz w:val="20"/>
+        </w:rPr>
+        <w:t>|Charlie|  22|    Chicago|        264|</w:t>
+      </w:r>
+    </w:p>
+    <w:p>
+      <w:pPr>
+        <w:spacing w:after="0"/>
+      </w:pPr>
+      <w:r>
+        <w:rPr>
+          <w:rFonts w:ascii="Courier New" w:hAnsi="Courier New"/>
+          <w:color w:val="1A1A1A"/>
+          <w:sz w:val="20"/>
+        </w:rPr>
+        <w:t>+-------+----+-----------+-----------+</w:t>
+      </w:r>
+    </w:p>
+    <w:p>
+      <w:pPr>
+        <w:spacing w:after="120"/>
+      </w:pPr>
+    </w:p>
+    <w:p>
+      <w:pPr>
+        <w:spacing w:after="200"/>
+      </w:pPr>
+      <w:r>
+        <w:t>Concatenar nombre y ciudad en un solo campo de texto:</w:t>
       </w:r>
     </w:p>
     <w:p>
@@ -400,20 +1470,38 @@
           <w:color w:val="333333"/>
           <w:sz w:val="20"/>
         </w:rPr>
-        <w:t xml:space="preserve"> </w:t>
+        <w:t>df.withColumn("InformacionPersonal", concat(col("Nombre"), lit(" - "), col("Ciudad"))).show()</w:t>
       </w:r>
     </w:p>
     <w:p>
       <w:pPr>
+        <w:spacing w:after="120"/>
+      </w:pPr>
+    </w:p>
+    <w:p>
+      <w:pPr>
+        <w:spacing w:after="40"/>
+      </w:pPr>
+      <w:r>
+        <w:rPr>
+          <w:i/>
+          <w:color w:val="666666"/>
+          <w:sz w:val="20"/>
+        </w:rPr>
+        <w:t>Resultado:</w:t>
+      </w:r>
+    </w:p>
+    <w:p>
+      <w:pPr>
         <w:spacing w:after="0"/>
       </w:pPr>
       <w:r>
         <w:rPr>
           <w:rFonts w:ascii="Courier New" w:hAnsi="Courier New"/>
-          <w:color w:val="333333"/>
+          <w:color w:val="1A1A1A"/>
           <w:sz w:val="20"/>
         </w:rPr>
-        <w:t># Eliminar una columna</w:t>
+        <w:t>+-------+----+-----------+-------------------+</w:t>
       </w:r>
     </w:p>
     <w:p>
@@ -423,10 +1511,10 @@
       <w:r>
         <w:rPr>
           <w:rFonts w:ascii="Courier New" w:hAnsi="Courier New"/>
-          <w:color w:val="333333"/>
+          <w:color w:val="1A1A1A"/>
           <w:sz w:val="20"/>
         </w:rPr>
-        <w:t>df.drop("Edad")</w:t>
+        <w:t>| Nombre|Edad|     Ciudad|InformacionPersonal|</w:t>
       </w:r>
     </w:p>
     <w:p>
@@ -436,10 +1524,10 @@
       <w:r>
         <w:rPr>
           <w:rFonts w:ascii="Courier New" w:hAnsi="Courier New"/>
-          <w:color w:val="333333"/>
+          <w:color w:val="1A1A1A"/>
           <w:sz w:val="20"/>
         </w:rPr>
-        <w:t xml:space="preserve"> </w:t>
+        <w:t>+-------+----+-----------+-------------------+</w:t>
       </w:r>
     </w:p>
     <w:p>
@@ -449,10 +1537,10 @@
       <w:r>
         <w:rPr>
           <w:rFonts w:ascii="Courier New" w:hAnsi="Courier New"/>
-          <w:color w:val="333333"/>
+          <w:color w:val="1A1A1A"/>
           <w:sz w:val="20"/>
         </w:rPr>
-        <w:t># Columna calculada: el doble de la edad</w:t>
+        <w:t>|  Alice|  25|   New York|   Alice - New York|</w:t>
       </w:r>
     </w:p>
     <w:p>
@@ -462,10 +1550,10 @@
       <w:r>
         <w:rPr>
           <w:rFonts w:ascii="Courier New" w:hAnsi="Courier New"/>
-          <w:color w:val="333333"/>
+          <w:color w:val="1A1A1A"/>
           <w:sz w:val="20"/>
         </w:rPr>
-        <w:t>df.withColumn("EdadDuplicada", col("Edad") * 2)</w:t>
+        <w:t>|    Bob|  30|Los Angeles|  Bob - Los Angeles|</w:t>
       </w:r>
     </w:p>
     <w:p>
@@ -475,10 +1563,10 @@
       <w:r>
         <w:rPr>
           <w:rFonts w:ascii="Courier New" w:hAnsi="Courier New"/>
-          <w:color w:val="333333"/>
+          <w:color w:val="1A1A1A"/>
           <w:sz w:val="20"/>
         </w:rPr>
-        <w:t xml:space="preserve"> </w:t>
+        <w:t>|Charlie|  22|    Chicago|  Charlie - Chicago|</w:t>
       </w:r>
     </w:p>
     <w:p>
@@ -488,62 +1576,10 @@
       <w:r>
         <w:rPr>
           <w:rFonts w:ascii="Courier New" w:hAnsi="Courier New"/>
-          <w:color w:val="333333"/>
+          <w:color w:val="1A1A1A"/>
           <w:sz w:val="20"/>
         </w:rPr>
-        <w:t># Conversión de años a meses</w:t>
-      </w:r>
-    </w:p>
-    <w:p>
-      <w:pPr>
-        <w:spacing w:after="0"/>
-      </w:pPr>
-      <w:r>
-        <w:rPr>
-          <w:rFonts w:ascii="Courier New" w:hAnsi="Courier New"/>
-          <w:color w:val="333333"/>
-          <w:sz w:val="20"/>
-        </w:rPr>
-        <w:t>df.withColumn("EdadEnMeses", col("Edad") * 12)</w:t>
-      </w:r>
-    </w:p>
-    <w:p>
-      <w:pPr>
-        <w:spacing w:after="0"/>
-      </w:pPr>
-      <w:r>
-        <w:rPr>
-          <w:rFonts w:ascii="Courier New" w:hAnsi="Courier New"/>
-          <w:color w:val="333333"/>
-          <w:sz w:val="20"/>
-        </w:rPr>
-        <w:t xml:space="preserve"> </w:t>
-      </w:r>
-    </w:p>
-    <w:p>
-      <w:pPr>
-        <w:spacing w:after="0"/>
-      </w:pPr>
-      <w:r>
-        <w:rPr>
-          <w:rFonts w:ascii="Courier New" w:hAnsi="Courier New"/>
-          <w:color w:val="333333"/>
-          <w:sz w:val="20"/>
-        </w:rPr>
-        <w:t># Concatenar nombre y ciudad en un solo campo de texto</w:t>
-      </w:r>
-    </w:p>
-    <w:p>
-      <w:pPr>
-        <w:spacing w:after="0"/>
-      </w:pPr>
-      <w:r>
-        <w:rPr>
-          <w:rFonts w:ascii="Courier New" w:hAnsi="Courier New"/>
-          <w:color w:val="333333"/>
-          <w:sz w:val="20"/>
-        </w:rPr>
-        <w:t>df.withColumn("InformacionPersonal", concat(col("Nombre"), lit(" - "), col("Ciudad")))</w:t>
+        <w:t>+-------+----+-----------+-------------------+</w:t>
       </w:r>
     </w:p>
     <w:p>
@@ -582,6 +1618,94 @@
     </w:p>
     <w:p>
       <w:pPr>
+        <w:spacing w:after="120"/>
+      </w:pPr>
+    </w:p>
+    <w:p>
+      <w:pPr>
+        <w:spacing w:after="40"/>
+      </w:pPr>
+      <w:r>
+        <w:rPr>
+          <w:i/>
+          <w:color w:val="666666"/>
+          <w:sz w:val="20"/>
+        </w:rPr>
+        <w:t>Resultado:</w:t>
+      </w:r>
+    </w:p>
+    <w:p>
+      <w:pPr>
+        <w:spacing w:after="0"/>
+      </w:pPr>
+      <w:r>
+        <w:rPr>
+          <w:rFonts w:ascii="Courier New" w:hAnsi="Courier New"/>
+          <w:color w:val="1A1A1A"/>
+          <w:sz w:val="20"/>
+        </w:rPr>
+        <w:t>+------------------+</w:t>
+      </w:r>
+    </w:p>
+    <w:p>
+      <w:pPr>
+        <w:spacing w:after="0"/>
+      </w:pPr>
+      <w:r>
+        <w:rPr>
+          <w:rFonts w:ascii="Courier New" w:hAnsi="Courier New"/>
+          <w:color w:val="1A1A1A"/>
+          <w:sz w:val="20"/>
+        </w:rPr>
+        <w:t>|      EdadPromedio|</w:t>
+      </w:r>
+    </w:p>
+    <w:p>
+      <w:pPr>
+        <w:spacing w:after="0"/>
+      </w:pPr>
+      <w:r>
+        <w:rPr>
+          <w:rFonts w:ascii="Courier New" w:hAnsi="Courier New"/>
+          <w:color w:val="1A1A1A"/>
+          <w:sz w:val="20"/>
+        </w:rPr>
+        <w:t>+------------------+</w:t>
+      </w:r>
+    </w:p>
+    <w:p>
+      <w:pPr>
+        <w:spacing w:after="0"/>
+      </w:pPr>
+      <w:r>
+        <w:rPr>
+          <w:rFonts w:ascii="Courier New" w:hAnsi="Courier New"/>
+          <w:color w:val="1A1A1A"/>
+          <w:sz w:val="20"/>
+        </w:rPr>
+        <w:t>|25.666666666666668|</w:t>
+      </w:r>
+    </w:p>
+    <w:p>
+      <w:pPr>
+        <w:spacing w:after="0"/>
+      </w:pPr>
+      <w:r>
+        <w:rPr>
+          <w:rFonts w:ascii="Courier New" w:hAnsi="Courier New"/>
+          <w:color w:val="1A1A1A"/>
+          <w:sz w:val="20"/>
+        </w:rPr>
+        <w:t>+------------------+</w:t>
+      </w:r>
+    </w:p>
+    <w:p>
+      <w:pPr>
+        <w:spacing w:after="120"/>
+      </w:pPr>
+    </w:p>
+    <w:p>
+      <w:pPr>
         <w:spacing w:after="0"/>
       </w:pPr>
       <w:r>
@@ -595,6 +1719,94 @@
     </w:p>
     <w:p>
       <w:pPr>
+        <w:spacing w:after="120"/>
+      </w:pPr>
+    </w:p>
+    <w:p>
+      <w:pPr>
+        <w:spacing w:after="40"/>
+      </w:pPr>
+      <w:r>
+        <w:rPr>
+          <w:i/>
+          <w:color w:val="666666"/>
+          <w:sz w:val="20"/>
+        </w:rPr>
+        <w:t>Resultado:</w:t>
+      </w:r>
+    </w:p>
+    <w:p>
+      <w:pPr>
+        <w:spacing w:after="0"/>
+      </w:pPr>
+      <w:r>
+        <w:rPr>
+          <w:rFonts w:ascii="Courier New" w:hAnsi="Courier New"/>
+          <w:color w:val="1A1A1A"/>
+          <w:sz w:val="20"/>
+        </w:rPr>
+        <w:t>+----------+</w:t>
+      </w:r>
+    </w:p>
+    <w:p>
+      <w:pPr>
+        <w:spacing w:after="0"/>
+      </w:pPr>
+      <w:r>
+        <w:rPr>
+          <w:rFonts w:ascii="Courier New" w:hAnsi="Courier New"/>
+          <w:color w:val="1A1A1A"/>
+          <w:sz w:val="20"/>
+        </w:rPr>
+        <w:t>|SumaEdades|</w:t>
+      </w:r>
+    </w:p>
+    <w:p>
+      <w:pPr>
+        <w:spacing w:after="0"/>
+      </w:pPr>
+      <w:r>
+        <w:rPr>
+          <w:rFonts w:ascii="Courier New" w:hAnsi="Courier New"/>
+          <w:color w:val="1A1A1A"/>
+          <w:sz w:val="20"/>
+        </w:rPr>
+        <w:t>+----------+</w:t>
+      </w:r>
+    </w:p>
+    <w:p>
+      <w:pPr>
+        <w:spacing w:after="0"/>
+      </w:pPr>
+      <w:r>
+        <w:rPr>
+          <w:rFonts w:ascii="Courier New" w:hAnsi="Courier New"/>
+          <w:color w:val="1A1A1A"/>
+          <w:sz w:val="20"/>
+        </w:rPr>
+        <w:t>|        77|</w:t>
+      </w:r>
+    </w:p>
+    <w:p>
+      <w:pPr>
+        <w:spacing w:after="0"/>
+      </w:pPr>
+      <w:r>
+        <w:rPr>
+          <w:rFonts w:ascii="Courier New" w:hAnsi="Courier New"/>
+          <w:color w:val="1A1A1A"/>
+          <w:sz w:val="20"/>
+        </w:rPr>
+        <w:t>+----------+</w:t>
+      </w:r>
+    </w:p>
+    <w:p>
+      <w:pPr>
+        <w:spacing w:after="120"/>
+      </w:pPr>
+    </w:p>
+    <w:p>
+      <w:pPr>
         <w:spacing w:after="0"/>
       </w:pPr>
       <w:r>
@@ -608,6 +1820,94 @@
     </w:p>
     <w:p>
       <w:pPr>
+        <w:spacing w:after="120"/>
+      </w:pPr>
+    </w:p>
+    <w:p>
+      <w:pPr>
+        <w:spacing w:after="40"/>
+      </w:pPr>
+      <w:r>
+        <w:rPr>
+          <w:i/>
+          <w:color w:val="666666"/>
+          <w:sz w:val="20"/>
+        </w:rPr>
+        <w:t>Resultado:</w:t>
+      </w:r>
+    </w:p>
+    <w:p>
+      <w:pPr>
+        <w:spacing w:after="0"/>
+      </w:pPr>
+      <w:r>
+        <w:rPr>
+          <w:rFonts w:ascii="Courier New" w:hAnsi="Courier New"/>
+          <w:color w:val="1A1A1A"/>
+          <w:sz w:val="20"/>
+        </w:rPr>
+        <w:t>+----------+----------+</w:t>
+      </w:r>
+    </w:p>
+    <w:p>
+      <w:pPr>
+        <w:spacing w:after="0"/>
+      </w:pPr>
+      <w:r>
+        <w:rPr>
+          <w:rFonts w:ascii="Courier New" w:hAnsi="Courier New"/>
+          <w:color w:val="1A1A1A"/>
+          <w:sz w:val="20"/>
+        </w:rPr>
+        <w:t>|EdadMinima|EdadMaxima|</w:t>
+      </w:r>
+    </w:p>
+    <w:p>
+      <w:pPr>
+        <w:spacing w:after="0"/>
+      </w:pPr>
+      <w:r>
+        <w:rPr>
+          <w:rFonts w:ascii="Courier New" w:hAnsi="Courier New"/>
+          <w:color w:val="1A1A1A"/>
+          <w:sz w:val="20"/>
+        </w:rPr>
+        <w:t>+----------+----------+</w:t>
+      </w:r>
+    </w:p>
+    <w:p>
+      <w:pPr>
+        <w:spacing w:after="0"/>
+      </w:pPr>
+      <w:r>
+        <w:rPr>
+          <w:rFonts w:ascii="Courier New" w:hAnsi="Courier New"/>
+          <w:color w:val="1A1A1A"/>
+          <w:sz w:val="20"/>
+        </w:rPr>
+        <w:t>|        22|        30|</w:t>
+      </w:r>
+    </w:p>
+    <w:p>
+      <w:pPr>
+        <w:spacing w:after="0"/>
+      </w:pPr>
+      <w:r>
+        <w:rPr>
+          <w:rFonts w:ascii="Courier New" w:hAnsi="Courier New"/>
+          <w:color w:val="1A1A1A"/>
+          <w:sz w:val="20"/>
+        </w:rPr>
+        <w:t>+----------+----------+</w:t>
+      </w:r>
+    </w:p>
+    <w:p>
+      <w:pPr>
+        <w:spacing w:after="120"/>
+      </w:pPr>
+    </w:p>
+    <w:p>
+      <w:pPr>
         <w:spacing w:after="0"/>
       </w:pPr>
       <w:r>
@@ -616,28 +1916,7 @@
           <w:color w:val="333333"/>
           <w:sz w:val="20"/>
         </w:rPr>
-        <w:t>df.count()</w:t>
-      </w:r>
-    </w:p>
-    <w:p>
-      <w:pPr>
-        <w:spacing w:after="120"/>
-      </w:pPr>
-    </w:p>
-    <w:p>
-      <w:pPr>
-        <w:pStyle w:val="Heading1"/>
-      </w:pPr>
-      <w:r>
-        <w:t>Agrupamiento y clasificación</w:t>
-      </w:r>
-    </w:p>
-    <w:p>
-      <w:pPr>
-        <w:spacing w:after="200"/>
-      </w:pPr>
-      <w:r>
-        <w:t>groupBy() combinado con count() y con when()/otherwise() permite construir agrupamientos y categorías directamente sobre el DataFrame:</w:t>
+        <w:t>total_personas = df.count()</w:t>
       </w:r>
     </w:p>
     <w:p>
@@ -650,7 +1929,67 @@
           <w:color w:val="333333"/>
           <w:sz w:val="20"/>
         </w:rPr>
-        <w:t># Cantidad de personas por ciudad</w:t>
+        <w:t>print(f"Total de personas: {total_personas}")</w:t>
+      </w:r>
+    </w:p>
+    <w:p>
+      <w:pPr>
+        <w:spacing w:after="120"/>
+      </w:pPr>
+    </w:p>
+    <w:p>
+      <w:pPr>
+        <w:spacing w:after="40"/>
+      </w:pPr>
+      <w:r>
+        <w:rPr>
+          <w:i/>
+          <w:color w:val="666666"/>
+          <w:sz w:val="20"/>
+        </w:rPr>
+        <w:t>Resultado:</w:t>
+      </w:r>
+    </w:p>
+    <w:p>
+      <w:pPr>
+        <w:spacing w:after="0"/>
+      </w:pPr>
+      <w:r>
+        <w:rPr>
+          <w:rFonts w:ascii="Courier New" w:hAnsi="Courier New"/>
+          <w:color w:val="1A1A1A"/>
+          <w:sz w:val="20"/>
+        </w:rPr>
+        <w:t>Total de personas: 3</w:t>
+      </w:r>
+    </w:p>
+    <w:p>
+      <w:pPr>
+        <w:spacing w:after="120"/>
+      </w:pPr>
+    </w:p>
+    <w:p>
+      <w:pPr>
+        <w:pStyle w:val="Heading1"/>
+      </w:pPr>
+      <w:r>
+        <w:t>Agrupamiento y clasificación</w:t>
+      </w:r>
+    </w:p>
+    <w:p>
+      <w:pPr>
+        <w:spacing w:after="200"/>
+      </w:pPr>
+      <w:r>
+        <w:t>groupBy() combinado con count() y con when()/otherwise() permite construir agrupamientos y categorías directamente sobre el DataFrame:</w:t>
+      </w:r>
+    </w:p>
+    <w:p>
+      <w:pPr>
+        <w:spacing w:after="200"/>
+      </w:pPr>
+      <w:r>
+        <w:t>Cantidad de personas por ciudad:</w:t>
       </w:r>
     </w:p>
     <w:p>
@@ -668,15 +2007,33 @@
     </w:p>
     <w:p>
       <w:pPr>
+        <w:spacing w:after="120"/>
+      </w:pPr>
+    </w:p>
+    <w:p>
+      <w:pPr>
+        <w:spacing w:after="40"/>
+      </w:pPr>
+      <w:r>
+        <w:rPr>
+          <w:i/>
+          <w:color w:val="666666"/>
+          <w:sz w:val="20"/>
+        </w:rPr>
+        <w:t>Resultado:</w:t>
+      </w:r>
+    </w:p>
+    <w:p>
+      <w:pPr>
         <w:spacing w:after="0"/>
       </w:pPr>
       <w:r>
         <w:rPr>
           <w:rFonts w:ascii="Courier New" w:hAnsi="Courier New"/>
-          <w:color w:val="333333"/>
+          <w:color w:val="1A1A1A"/>
           <w:sz w:val="20"/>
         </w:rPr>
-        <w:t xml:space="preserve"> </w:t>
+        <w:t>+-----------+-----+</w:t>
       </w:r>
     </w:p>
     <w:p>
@@ -686,10 +2043,88 @@
       <w:r>
         <w:rPr>
           <w:rFonts w:ascii="Courier New" w:hAnsi="Courier New"/>
-          <w:color w:val="333333"/>
+          <w:color w:val="1A1A1A"/>
           <w:sz w:val="20"/>
         </w:rPr>
-        <w:t># Orden descendente por edad</w:t>
+        <w:t>|     Ciudad|count|</w:t>
+      </w:r>
+    </w:p>
+    <w:p>
+      <w:pPr>
+        <w:spacing w:after="0"/>
+      </w:pPr>
+      <w:r>
+        <w:rPr>
+          <w:rFonts w:ascii="Courier New" w:hAnsi="Courier New"/>
+          <w:color w:val="1A1A1A"/>
+          <w:sz w:val="20"/>
+        </w:rPr>
+        <w:t>+-----------+-----+</w:t>
+      </w:r>
+    </w:p>
+    <w:p>
+      <w:pPr>
+        <w:spacing w:after="0"/>
+      </w:pPr>
+      <w:r>
+        <w:rPr>
+          <w:rFonts w:ascii="Courier New" w:hAnsi="Courier New"/>
+          <w:color w:val="1A1A1A"/>
+          <w:sz w:val="20"/>
+        </w:rPr>
+        <w:t>|    Chicago|    1|</w:t>
+      </w:r>
+    </w:p>
+    <w:p>
+      <w:pPr>
+        <w:spacing w:after="0"/>
+      </w:pPr>
+      <w:r>
+        <w:rPr>
+          <w:rFonts w:ascii="Courier New" w:hAnsi="Courier New"/>
+          <w:color w:val="1A1A1A"/>
+          <w:sz w:val="20"/>
+        </w:rPr>
+        <w:t>|Los Angeles|    1|</w:t>
+      </w:r>
+    </w:p>
+    <w:p>
+      <w:pPr>
+        <w:spacing w:after="0"/>
+      </w:pPr>
+      <w:r>
+        <w:rPr>
+          <w:rFonts w:ascii="Courier New" w:hAnsi="Courier New"/>
+          <w:color w:val="1A1A1A"/>
+          <w:sz w:val="20"/>
+        </w:rPr>
+        <w:t>|   New York|    1|</w:t>
+      </w:r>
+    </w:p>
+    <w:p>
+      <w:pPr>
+        <w:spacing w:after="0"/>
+      </w:pPr>
+      <w:r>
+        <w:rPr>
+          <w:rFonts w:ascii="Courier New" w:hAnsi="Courier New"/>
+          <w:color w:val="1A1A1A"/>
+          <w:sz w:val="20"/>
+        </w:rPr>
+        <w:t>+-----------+-----+</w:t>
+      </w:r>
+    </w:p>
+    <w:p>
+      <w:pPr>
+        <w:spacing w:after="120"/>
+      </w:pPr>
+    </w:p>
+    <w:p>
+      <w:pPr>
+        <w:spacing w:after="200"/>
+      </w:pPr>
+      <w:r>
+        <w:t>Orden descendente por edad:</w:t>
       </w:r>
     </w:p>
     <w:p>
@@ -707,15 +2142,33 @@
     </w:p>
     <w:p>
       <w:pPr>
+        <w:spacing w:after="120"/>
+      </w:pPr>
+    </w:p>
+    <w:p>
+      <w:pPr>
+        <w:spacing w:after="40"/>
+      </w:pPr>
+      <w:r>
+        <w:rPr>
+          <w:i/>
+          <w:color w:val="666666"/>
+          <w:sz w:val="20"/>
+        </w:rPr>
+        <w:t>Resultado:</w:t>
+      </w:r>
+    </w:p>
+    <w:p>
+      <w:pPr>
         <w:spacing w:after="0"/>
       </w:pPr>
       <w:r>
         <w:rPr>
           <w:rFonts w:ascii="Courier New" w:hAnsi="Courier New"/>
-          <w:color w:val="333333"/>
+          <w:color w:val="1A1A1A"/>
           <w:sz w:val="20"/>
         </w:rPr>
-        <w:t xml:space="preserve"> </w:t>
+        <w:t>+-------+----+-----------+</w:t>
       </w:r>
     </w:p>
     <w:p>
@@ -725,10 +2178,88 @@
       <w:r>
         <w:rPr>
           <w:rFonts w:ascii="Courier New" w:hAnsi="Courier New"/>
-          <w:color w:val="333333"/>
+          <w:color w:val="1A1A1A"/>
           <w:sz w:val="20"/>
         </w:rPr>
-        <w:t># Clasificación por rango etario</w:t>
+        <w:t>| Nombre|Edad|     Ciudad|</w:t>
+      </w:r>
+    </w:p>
+    <w:p>
+      <w:pPr>
+        <w:spacing w:after="0"/>
+      </w:pPr>
+      <w:r>
+        <w:rPr>
+          <w:rFonts w:ascii="Courier New" w:hAnsi="Courier New"/>
+          <w:color w:val="1A1A1A"/>
+          <w:sz w:val="20"/>
+        </w:rPr>
+        <w:t>+-------+----+-----------+</w:t>
+      </w:r>
+    </w:p>
+    <w:p>
+      <w:pPr>
+        <w:spacing w:after="0"/>
+      </w:pPr>
+      <w:r>
+        <w:rPr>
+          <w:rFonts w:ascii="Courier New" w:hAnsi="Courier New"/>
+          <w:color w:val="1A1A1A"/>
+          <w:sz w:val="20"/>
+        </w:rPr>
+        <w:t>|    Bob|  30|Los Angeles|</w:t>
+      </w:r>
+    </w:p>
+    <w:p>
+      <w:pPr>
+        <w:spacing w:after="0"/>
+      </w:pPr>
+      <w:r>
+        <w:rPr>
+          <w:rFonts w:ascii="Courier New" w:hAnsi="Courier New"/>
+          <w:color w:val="1A1A1A"/>
+          <w:sz w:val="20"/>
+        </w:rPr>
+        <w:t>|  Alice|  25|   New York|</w:t>
+      </w:r>
+    </w:p>
+    <w:p>
+      <w:pPr>
+        <w:spacing w:after="0"/>
+      </w:pPr>
+      <w:r>
+        <w:rPr>
+          <w:rFonts w:ascii="Courier New" w:hAnsi="Courier New"/>
+          <w:color w:val="1A1A1A"/>
+          <w:sz w:val="20"/>
+        </w:rPr>
+        <w:t>|Charlie|  22|    Chicago|</w:t>
+      </w:r>
+    </w:p>
+    <w:p>
+      <w:pPr>
+        <w:spacing w:after="0"/>
+      </w:pPr>
+      <w:r>
+        <w:rPr>
+          <w:rFonts w:ascii="Courier New" w:hAnsi="Courier New"/>
+          <w:color w:val="1A1A1A"/>
+          <w:sz w:val="20"/>
+        </w:rPr>
+        <w:t>+-------+----+-----------+</w:t>
+      </w:r>
+    </w:p>
+    <w:p>
+      <w:pPr>
+        <w:spacing w:after="120"/>
+      </w:pPr>
+    </w:p>
+    <w:p>
+      <w:pPr>
+        <w:spacing w:after="200"/>
+      </w:pPr>
+      <w:r>
+        <w:t>Clasificación por rango etario:</w:t>
       </w:r>
     </w:p>
     <w:p>
@@ -837,6 +2368,102 @@
     </w:p>
     <w:p>
       <w:pPr>
+        <w:spacing w:after="120"/>
+      </w:pPr>
+    </w:p>
+    <w:p>
+      <w:pPr>
+        <w:spacing w:after="40"/>
+      </w:pPr>
+      <w:r>
+        <w:rPr>
+          <w:i/>
+          <w:color w:val="666666"/>
+          <w:sz w:val="20"/>
+        </w:rPr>
+        <w:t>Resultado:</w:t>
+      </w:r>
+    </w:p>
+    <w:p>
+      <w:pPr>
+        <w:spacing w:after="0"/>
+      </w:pPr>
+      <w:r>
+        <w:rPr>
+          <w:rFonts w:ascii="Courier New" w:hAnsi="Courier New"/>
+          <w:color w:val="1A1A1A"/>
+          <w:sz w:val="20"/>
+        </w:rPr>
+        <w:t>+---------+-----+</w:t>
+      </w:r>
+    </w:p>
+    <w:p>
+      <w:pPr>
+        <w:spacing w:after="0"/>
+      </w:pPr>
+      <w:r>
+        <w:rPr>
+          <w:rFonts w:ascii="Courier New" w:hAnsi="Courier New"/>
+          <w:color w:val="1A1A1A"/>
+          <w:sz w:val="20"/>
+        </w:rPr>
+        <w:t>|RangoEdad|count|</w:t>
+      </w:r>
+    </w:p>
+    <w:p>
+      <w:pPr>
+        <w:spacing w:after="0"/>
+      </w:pPr>
+      <w:r>
+        <w:rPr>
+          <w:rFonts w:ascii="Courier New" w:hAnsi="Courier New"/>
+          <w:color w:val="1A1A1A"/>
+          <w:sz w:val="20"/>
+        </w:rPr>
+        <w:t>+---------+-----+</w:t>
+      </w:r>
+    </w:p>
+    <w:p>
+      <w:pPr>
+        <w:spacing w:after="0"/>
+      </w:pPr>
+      <w:r>
+        <w:rPr>
+          <w:rFonts w:ascii="Courier New" w:hAnsi="Courier New"/>
+          <w:color w:val="1A1A1A"/>
+          <w:sz w:val="20"/>
+        </w:rPr>
+        <w:t>|    21-40|    3|</w:t>
+      </w:r>
+    </w:p>
+    <w:p>
+      <w:pPr>
+        <w:spacing w:after="0"/>
+      </w:pPr>
+      <w:r>
+        <w:rPr>
+          <w:rFonts w:ascii="Courier New" w:hAnsi="Courier New"/>
+          <w:color w:val="1A1A1A"/>
+          <w:sz w:val="20"/>
+        </w:rPr>
+        <w:t>+---------+-----+</w:t>
+      </w:r>
+    </w:p>
+    <w:p>
+      <w:pPr>
+        <w:spacing w:after="120"/>
+      </w:pPr>
+    </w:p>
+    <w:p>
+      <w:pPr>
+        <w:spacing w:after="200"/>
+      </w:pPr>
+      <w:r>
+        <w:t>Cantidad de personas por nombre:</w:t>
+      </w:r>
+    </w:p>
+    <w:p>
+      <w:pPr>
         <w:spacing w:after="0"/>
       </w:pPr>
       <w:r>
@@ -845,20 +2472,38 @@
           <w:color w:val="333333"/>
           <w:sz w:val="20"/>
         </w:rPr>
-        <w:t xml:space="preserve"> </w:t>
+        <w:t>df.groupBy("Nombre").count().withColumnRenamed("count", "Repeticiones").show()</w:t>
       </w:r>
     </w:p>
     <w:p>
       <w:pPr>
+        <w:spacing w:after="120"/>
+      </w:pPr>
+    </w:p>
+    <w:p>
+      <w:pPr>
+        <w:spacing w:after="40"/>
+      </w:pPr>
+      <w:r>
+        <w:rPr>
+          <w:i/>
+          <w:color w:val="666666"/>
+          <w:sz w:val="20"/>
+        </w:rPr>
+        <w:t>Resultado:</w:t>
+      </w:r>
+    </w:p>
+    <w:p>
+      <w:pPr>
         <w:spacing w:after="0"/>
       </w:pPr>
       <w:r>
         <w:rPr>
           <w:rFonts w:ascii="Courier New" w:hAnsi="Courier New"/>
-          <w:color w:val="333333"/>
+          <w:color w:val="1A1A1A"/>
           <w:sz w:val="20"/>
         </w:rPr>
-        <w:t># Cantidad de personas por nombre</w:t>
+        <w:t>+-------+------------+</w:t>
       </w:r>
     </w:p>
     <w:p>
@@ -868,10 +2513,75 @@
       <w:r>
         <w:rPr>
           <w:rFonts w:ascii="Courier New" w:hAnsi="Courier New"/>
-          <w:color w:val="333333"/>
+          <w:color w:val="1A1A1A"/>
           <w:sz w:val="20"/>
         </w:rPr>
-        <w:t>df.groupBy("Nombre").count().show()</w:t>
+        <w:t>| Nombre|Repeticiones|</w:t>
+      </w:r>
+    </w:p>
+    <w:p>
+      <w:pPr>
+        <w:spacing w:after="0"/>
+      </w:pPr>
+      <w:r>
+        <w:rPr>
+          <w:rFonts w:ascii="Courier New" w:hAnsi="Courier New"/>
+          <w:color w:val="1A1A1A"/>
+          <w:sz w:val="20"/>
+        </w:rPr>
+        <w:t>+-------+------------+</w:t>
+      </w:r>
+    </w:p>
+    <w:p>
+      <w:pPr>
+        <w:spacing w:after="0"/>
+      </w:pPr>
+      <w:r>
+        <w:rPr>
+          <w:rFonts w:ascii="Courier New" w:hAnsi="Courier New"/>
+          <w:color w:val="1A1A1A"/>
+          <w:sz w:val="20"/>
+        </w:rPr>
+        <w:t>|  Alice|           1|</w:t>
+      </w:r>
+    </w:p>
+    <w:p>
+      <w:pPr>
+        <w:spacing w:after="0"/>
+      </w:pPr>
+      <w:r>
+        <w:rPr>
+          <w:rFonts w:ascii="Courier New" w:hAnsi="Courier New"/>
+          <w:color w:val="1A1A1A"/>
+          <w:sz w:val="20"/>
+        </w:rPr>
+        <w:t>|    Bob|           1|</w:t>
+      </w:r>
+    </w:p>
+    <w:p>
+      <w:pPr>
+        <w:spacing w:after="0"/>
+      </w:pPr>
+      <w:r>
+        <w:rPr>
+          <w:rFonts w:ascii="Courier New" w:hAnsi="Courier New"/>
+          <w:color w:val="1A1A1A"/>
+          <w:sz w:val="20"/>
+        </w:rPr>
+        <w:t>|Charlie|           1|</w:t>
+      </w:r>
+    </w:p>
+    <w:p>
+      <w:pPr>
+        <w:spacing w:after="0"/>
+      </w:pPr>
+      <w:r>
+        <w:rPr>
+          <w:rFonts w:ascii="Courier New" w:hAnsi="Courier New"/>
+          <w:color w:val="1A1A1A"/>
+          <w:sz w:val="20"/>
+        </w:rPr>
+        <w:t>+-------+------------+</w:t>
       </w:r>
     </w:p>
     <w:p>
@@ -928,6 +2638,115 @@
     </w:p>
     <w:p>
       <w:pPr>
+        <w:spacing w:after="40"/>
+      </w:pPr>
+      <w:r>
+        <w:rPr>
+          <w:i/>
+          <w:color w:val="666666"/>
+          <w:sz w:val="20"/>
+        </w:rPr>
+        <w:t>Resultado:</w:t>
+      </w:r>
+    </w:p>
+    <w:p>
+      <w:pPr>
+        <w:spacing w:after="0"/>
+      </w:pPr>
+      <w:r>
+        <w:rPr>
+          <w:rFonts w:ascii="Courier New" w:hAnsi="Courier New"/>
+          <w:color w:val="1A1A1A"/>
+          <w:sz w:val="20"/>
+        </w:rPr>
+        <w:t>+-------+----+-----------+</w:t>
+      </w:r>
+    </w:p>
+    <w:p>
+      <w:pPr>
+        <w:spacing w:after="0"/>
+      </w:pPr>
+      <w:r>
+        <w:rPr>
+          <w:rFonts w:ascii="Courier New" w:hAnsi="Courier New"/>
+          <w:color w:val="1A1A1A"/>
+          <w:sz w:val="20"/>
+        </w:rPr>
+        <w:t>| Nombre|Edad|     Ciudad|</w:t>
+      </w:r>
+    </w:p>
+    <w:p>
+      <w:pPr>
+        <w:spacing w:after="0"/>
+      </w:pPr>
+      <w:r>
+        <w:rPr>
+          <w:rFonts w:ascii="Courier New" w:hAnsi="Courier New"/>
+          <w:color w:val="1A1A1A"/>
+          <w:sz w:val="20"/>
+        </w:rPr>
+        <w:t>+-------+----+-----------+</w:t>
+      </w:r>
+    </w:p>
+    <w:p>
+      <w:pPr>
+        <w:spacing w:after="0"/>
+      </w:pPr>
+      <w:r>
+        <w:rPr>
+          <w:rFonts w:ascii="Courier New" w:hAnsi="Courier New"/>
+          <w:color w:val="1A1A1A"/>
+          <w:sz w:val="20"/>
+        </w:rPr>
+        <w:t>|  Alice|  25|   New York|</w:t>
+      </w:r>
+    </w:p>
+    <w:p>
+      <w:pPr>
+        <w:spacing w:after="0"/>
+      </w:pPr>
+      <w:r>
+        <w:rPr>
+          <w:rFonts w:ascii="Courier New" w:hAnsi="Courier New"/>
+          <w:color w:val="1A1A1A"/>
+          <w:sz w:val="20"/>
+        </w:rPr>
+        <w:t>|    Bob|  30|Los Angeles|</w:t>
+      </w:r>
+    </w:p>
+    <w:p>
+      <w:pPr>
+        <w:spacing w:after="0"/>
+      </w:pPr>
+      <w:r>
+        <w:rPr>
+          <w:rFonts w:ascii="Courier New" w:hAnsi="Courier New"/>
+          <w:color w:val="1A1A1A"/>
+          <w:sz w:val="20"/>
+        </w:rPr>
+        <w:t>|Charlie|  22|    Chicago|</w:t>
+      </w:r>
+    </w:p>
+    <w:p>
+      <w:pPr>
+        <w:spacing w:after="0"/>
+      </w:pPr>
+      <w:r>
+        <w:rPr>
+          <w:rFonts w:ascii="Courier New" w:hAnsi="Courier New"/>
+          <w:color w:val="1A1A1A"/>
+          <w:sz w:val="20"/>
+        </w:rPr>
+        <w:t>+-------+----+-----------+</w:t>
+      </w:r>
+    </w:p>
+    <w:p>
+      <w:pPr>
+        <w:spacing w:after="120"/>
+      </w:pPr>
+    </w:p>
+    <w:p>
+      <w:pPr>
         <w:pStyle w:val="Heading1"/>
       </w:pPr>
       <w:r>
@@ -978,13 +2797,15 @@
       <w:r>
         <w:t xml:space="preserve">Kevin Reyes Morocho — </w:t>
       </w:r>
-      <w:r>
-        <w:rPr>
-          <w:color w:val="0566C2"/>
-          <w:u w:val="single"/>
-        </w:rPr>
-        <w:t>linkedin.com/in/kevin-steven-reyes-morocho</w:t>
-      </w:r>
+      <w:hyperlink r:id="rId10">
+        <w:r>
+          <w:rPr>
+            <w:color w:val="0563C1"/>
+            <w:u w:val="single"/>
+          </w:rPr>
+          <w:t>linkedin.com/in/kevin-steven-reyes-morocho</w:t>
+        </w:r>
+      </w:hyperlink>
     </w:p>
     <w:sectPr>
       <w:pgSz w:w="12240" w:h="15840"/>

</xml_diff>